<commit_message>
new exposure plot scripts
</commit_message>
<xml_diff>
--- a/writing/analysis_planning/wf_disaster_ptb_jun_18.docx
+++ b/writing/analysis_planning/wf_disaster_ptb_jun_18.docx
@@ -389,15 +389,7 @@
         </w:numPr>
       </w:pPr>
       <w:r>
-        <w:t xml:space="preserve">Right </w:t>
-      </w:r>
-      <w:proofErr w:type="gramStart"/>
-      <w:r>
-        <w:t>now</w:t>
-      </w:r>
-      <w:proofErr w:type="gramEnd"/>
-      <w:r>
-        <w:t xml:space="preserve"> I think this extends </w:t>
+        <w:t xml:space="preserve">Right now I think this extends </w:t>
       </w:r>
       <w:r>
         <w:t xml:space="preserve">past when the preterm birth data ends so that will be the limiting factor. </w:t>
@@ -642,15 +634,7 @@
         </w:numPr>
       </w:pPr>
       <w:r>
-        <w:t xml:space="preserve">Once places are exposed to a </w:t>
-      </w:r>
-      <w:proofErr w:type="gramStart"/>
-      <w:r>
-        <w:t>disaster</w:t>
-      </w:r>
-      <w:proofErr w:type="gramEnd"/>
-      <w:r>
-        <w:t xml:space="preserve"> they likely experience effects for months if not years to come</w:t>
+        <w:t>Once places are exposed to a disaster they likely experience effects for months if not years to come</w:t>
       </w:r>
     </w:p>
     <w:p>
@@ -676,21 +660,8 @@
           <w:numId w:val="1"/>
         </w:numPr>
       </w:pPr>
-      <w:proofErr w:type="gramStart"/>
-      <w:r>
-        <w:t>So</w:t>
-      </w:r>
-      <w:proofErr w:type="gramEnd"/>
-      <w:r>
-        <w:t xml:space="preserve"> if a disaster starts in a </w:t>
-      </w:r>
-      <w:proofErr w:type="gramStart"/>
-      <w:r>
-        <w:t>month</w:t>
-      </w:r>
-      <w:proofErr w:type="gramEnd"/>
-      <w:r>
-        <w:t xml:space="preserve"> we’ll consider it exposed</w:t>
+      <w:r>
+        <w:t>So if a disaster starts in a month we’ll consider it exposed</w:t>
       </w:r>
     </w:p>
     <w:p>
@@ -744,15 +715,7 @@
         </w:numPr>
       </w:pPr>
       <w:r>
-        <w:t xml:space="preserve">Could look at places co-exposed to both a threshold of </w:t>
-      </w:r>
-      <w:proofErr w:type="spellStart"/>
-      <w:r>
-        <w:t>wf</w:t>
-      </w:r>
-      <w:proofErr w:type="spellEnd"/>
-      <w:r>
-        <w:t xml:space="preserve"> pm or county-level power outage co-occurring with the wildfire disaster. But that might be outside the scope of this paper </w:t>
+        <w:t xml:space="preserve">Could look at places co-exposed to both a threshold of wf pm or county-level power outage co-occurring with the wildfire disaster. But that might be outside the scope of this paper </w:t>
       </w:r>
     </w:p>
     <w:p>
@@ -868,15 +831,7 @@
         </w:numPr>
       </w:pPr>
       <w:r>
-        <w:t>New address by the time their hospitalized/</w:t>
-      </w:r>
-      <w:proofErr w:type="spellStart"/>
-      <w:r>
-        <w:t>ptb</w:t>
-      </w:r>
-      <w:proofErr w:type="spellEnd"/>
-      <w:r>
-        <w:t xml:space="preserve"> – composition of people needs to be the same </w:t>
+        <w:t xml:space="preserve">New address by the time their hospitalized/ptb – composition of people needs to be the same </w:t>
       </w:r>
     </w:p>
     <w:p>
@@ -1151,15 +1106,7 @@
         </w:numPr>
       </w:pPr>
       <w:r>
-        <w:t xml:space="preserve">Once the washout period is </w:t>
-      </w:r>
-      <w:proofErr w:type="gramStart"/>
-      <w:r>
-        <w:t>over</w:t>
-      </w:r>
-      <w:proofErr w:type="gramEnd"/>
-      <w:r>
-        <w:t xml:space="preserve"> we’ll treat the previously exposed region like a new region </w:t>
+        <w:t xml:space="preserve">Once the washout period is over we’ll treat the previously exposed region like a new region </w:t>
       </w:r>
     </w:p>
     <w:p>
@@ -1323,15 +1270,7 @@
         </w:numPr>
       </w:pPr>
       <w:r>
-        <w:t xml:space="preserve">Day of week effects, population changes, changes in evacuation and warning procedures, changes in fire size and severity, and other things could affect the effect of </w:t>
-      </w:r>
-      <w:proofErr w:type="spellStart"/>
-      <w:r>
-        <w:t>wf</w:t>
-      </w:r>
-      <w:proofErr w:type="spellEnd"/>
-      <w:r>
-        <w:t xml:space="preserve"> on </w:t>
+        <w:t xml:space="preserve">Day of week effects, population changes, changes in evacuation and warning procedures, changes in fire size and severity, and other things could affect the effect of wf on </w:t>
       </w:r>
       <w:r>
         <w:t>PTB or infant mort</w:t>
@@ -1459,13 +1398,8 @@
         </w:numPr>
       </w:pPr>
       <w:r>
-        <w:t xml:space="preserve">did package </w:t>
-      </w:r>
-      <w:proofErr w:type="gramStart"/>
-      <w:r>
-        <w:t>has</w:t>
-      </w:r>
-      <w:proofErr w:type="gramEnd"/>
+        <w:t>did package has</w:t>
+      </w:r>
       <w:r>
         <w:t xml:space="preserve"> a test </w:t>
       </w:r>
@@ -1706,15 +1640,7 @@
     </w:p>
     <w:p>
       <w:r>
-        <w:t xml:space="preserve">Test for autocorrelation </w:t>
-      </w:r>
-      <w:proofErr w:type="spellStart"/>
-      <w:r>
-        <w:t>moran’s</w:t>
-      </w:r>
-      <w:proofErr w:type="spellEnd"/>
-      <w:r>
-        <w:t xml:space="preserve"> I </w:t>
+        <w:t xml:space="preserve">Test for autocorrelation moran’s I </w:t>
       </w:r>
       <w:r>
         <w:t xml:space="preserve">(of the residuals) </w:t>
@@ -1758,22 +1684,9 @@
           <w:numId w:val="2"/>
         </w:numPr>
       </w:pPr>
-      <w:proofErr w:type="gramStart"/>
       <w:r>
         <w:lastRenderedPageBreak/>
-        <w:t>Also</w:t>
-      </w:r>
-      <w:proofErr w:type="gramEnd"/>
-      <w:r>
-        <w:t xml:space="preserve"> might want to analyze things separately for different eras (2000-2005, 2006-2010, </w:t>
-      </w:r>
-      <w:proofErr w:type="spellStart"/>
-      <w:r>
-        <w:t>etc</w:t>
-      </w:r>
-      <w:proofErr w:type="spellEnd"/>
-      <w:r>
-        <w:t xml:space="preserve">). if we’re interested in heterogeneity as fires got larger and smoke etc. is a bigger issue later in the study period </w:t>
+        <w:t xml:space="preserve">Also might want to analyze things separately for different eras (2000-2005, 2006-2010, etc). if we’re interested in heterogeneity as fires got larger and smoke etc. is a bigger issue later in the study period </w:t>
       </w:r>
     </w:p>
     <w:p>
@@ -1810,15 +1723,7 @@
         </w:numPr>
       </w:pPr>
       <w:r>
-        <w:t xml:space="preserve">Rural infant </w:t>
-      </w:r>
-      <w:proofErr w:type="spellStart"/>
-      <w:r>
-        <w:t>moraltity</w:t>
-      </w:r>
-      <w:proofErr w:type="spellEnd"/>
-      <w:r>
-        <w:t xml:space="preserve"> counties might be suppressed with the infant mortality data </w:t>
+        <w:t xml:space="preserve">Rural infant moraltity counties might be suppressed with the infant mortality data </w:t>
       </w:r>
     </w:p>
     <w:p/>
@@ -1848,15 +1753,7 @@
         </w:numPr>
       </w:pPr>
       <w:r>
-        <w:t xml:space="preserve">Make a </w:t>
-      </w:r>
-      <w:proofErr w:type="spellStart"/>
-      <w:r>
-        <w:t>dag</w:t>
-      </w:r>
-      <w:proofErr w:type="spellEnd"/>
-      <w:r>
-        <w:t>?</w:t>
+        <w:t>Make a dag?</w:t>
       </w:r>
     </w:p>
     <w:p>
@@ -1909,108 +1806,71 @@
         </w:numPr>
       </w:pPr>
       <w:r>
-        <w:t xml:space="preserve">Number of exposures by </w:t>
-      </w:r>
-      <w:proofErr w:type="spellStart"/>
-      <w:r>
-        <w:t>zcta</w:t>
-      </w:r>
-      <w:proofErr w:type="spellEnd"/>
-      <w:r>
-        <w:t xml:space="preserve"> over the </w:t>
-      </w:r>
-      <w:proofErr w:type="gramStart"/>
-      <w:r>
-        <w:t>20 year</w:t>
-      </w:r>
-      <w:proofErr w:type="gramEnd"/>
-      <w:r>
-        <w:t xml:space="preserve"> period</w:t>
-      </w:r>
-    </w:p>
-    <w:p>
-      <w:pPr>
-        <w:pStyle w:val="ListParagraph"/>
-        <w:numPr>
-          <w:ilvl w:val="0"/>
-          <w:numId w:val="1"/>
-        </w:numPr>
-      </w:pPr>
-      <w:r>
-        <w:t xml:space="preserve">Number of exposures by </w:t>
-      </w:r>
-      <w:proofErr w:type="spellStart"/>
-      <w:r>
-        <w:t>zcta</w:t>
-      </w:r>
-      <w:proofErr w:type="spellEnd"/>
-      <w:r>
-        <w:t xml:space="preserve"> by year</w:t>
-      </w:r>
-    </w:p>
-    <w:p>
-      <w:pPr>
-        <w:pStyle w:val="ListParagraph"/>
-        <w:numPr>
-          <w:ilvl w:val="0"/>
-          <w:numId w:val="1"/>
-        </w:numPr>
-      </w:pPr>
-      <w:r>
-        <w:t xml:space="preserve">Hospitalizations by year by </w:t>
-      </w:r>
-      <w:proofErr w:type="spellStart"/>
-      <w:r>
-        <w:t>zcta</w:t>
-      </w:r>
-      <w:proofErr w:type="spellEnd"/>
-    </w:p>
-    <w:p>
-      <w:pPr>
-        <w:pStyle w:val="ListParagraph"/>
-        <w:numPr>
-          <w:ilvl w:val="0"/>
-          <w:numId w:val="1"/>
-        </w:numPr>
-      </w:pPr>
-      <w:r>
-        <w:t xml:space="preserve">Trend of total </w:t>
-      </w:r>
-      <w:proofErr w:type="spellStart"/>
-      <w:r>
-        <w:t>hosps</w:t>
-      </w:r>
-      <w:proofErr w:type="spellEnd"/>
-      <w:r>
-        <w:t xml:space="preserve"> by year </w:t>
-      </w:r>
-    </w:p>
-    <w:p>
-      <w:pPr>
-        <w:pStyle w:val="ListParagraph"/>
-        <w:numPr>
-          <w:ilvl w:val="0"/>
-          <w:numId w:val="1"/>
-        </w:numPr>
-      </w:pPr>
-      <w:r>
-        <w:t xml:space="preserve">Follow </w:t>
-      </w:r>
-      <w:proofErr w:type="spellStart"/>
-      <w:r>
-        <w:t>santanna’s</w:t>
-      </w:r>
-      <w:proofErr w:type="spellEnd"/>
-      <w:r>
-        <w:t xml:space="preserve"> checklist </w:t>
+        <w:t>Number of exposures by zcta over the 20 year period</w:t>
+      </w:r>
+    </w:p>
+    <w:p>
+      <w:pPr>
+        <w:pStyle w:val="ListParagraph"/>
+        <w:numPr>
+          <w:ilvl w:val="0"/>
+          <w:numId w:val="1"/>
+        </w:numPr>
+      </w:pPr>
+      <w:r>
+        <w:t>Number of exposures by zcta by year</w:t>
+      </w:r>
+    </w:p>
+    <w:p>
+      <w:pPr>
+        <w:pStyle w:val="ListParagraph"/>
+        <w:numPr>
+          <w:ilvl w:val="0"/>
+          <w:numId w:val="1"/>
+        </w:numPr>
+      </w:pPr>
+      <w:r>
+        <w:t>Hospitalizations by year by zcta</w:t>
+      </w:r>
+    </w:p>
+    <w:p>
+      <w:pPr>
+        <w:pStyle w:val="ListParagraph"/>
+        <w:numPr>
+          <w:ilvl w:val="0"/>
+          <w:numId w:val="1"/>
+        </w:numPr>
+      </w:pPr>
+      <w:r>
+        <w:t xml:space="preserve">Trend of total hosps by year </w:t>
+      </w:r>
+    </w:p>
+    <w:p>
+      <w:pPr>
+        <w:pStyle w:val="ListParagraph"/>
+        <w:numPr>
+          <w:ilvl w:val="0"/>
+          <w:numId w:val="1"/>
+        </w:numPr>
+      </w:pPr>
+      <w:r>
+        <w:t xml:space="preserve">Follow santanna’s checklist </w:t>
       </w:r>
     </w:p>
     <w:p/>
     <w:p>
-      <w:r>
-        <w:t>https://www.healthaffairs.org/content/forefront/area-deprivation-index-most-scientifically-validated-social-exposome-tool-available</w:t>
-      </w:r>
-    </w:p>
+      <w:hyperlink r:id="rId6" w:history="1">
+        <w:r>
+          <w:rPr>
+            <w:rStyle w:val="Hyperlink"/>
+          </w:rPr>
+          <w:t>https://www.healthaffairs.org/content/forefront/area-deprivation-index-most-scientifically-validated-social-exposome-tool-available</w:t>
+        </w:r>
+      </w:hyperlink>
+    </w:p>
+    <w:p/>
+    <w:p/>
+    <w:p/>
     <w:sectPr>
       <w:pgSz w:w="12240" w:h="15840"/>
       <w:pgMar w:top="1440" w:right="1440" w:bottom="1440" w:left="1440" w:header="708" w:footer="708" w:gutter="0"/>

</xml_diff>